<commit_message>
Point the hub at the rebuilt repos and drop the cockpit name
The two credit and tearsheet repos were rebuilt with clean history under
new names, so the old links now 404:

  wholesale-credit-cockpit -> wholesale-credit-monitor
  tearsheet                -> portfolio-tearsheet

Project 01 is retitled "Wholesale Credit Early-Warning & MI Monitor" and
the Streamlit link label no longer says cockpit.

Project 03 is the Portfolio Tearsheet, matching the four projects on the
resume. Portfolio Analytics stays public but is no longer listed.

The download is now the single combined resume, since the two role-split
variants described a project that is no longer on the hub.

Co-Authored-By: Claude Opus 5 <noreply@anthropic.com>
</commit_message>
<xml_diff>
--- a/assets/Tatva_Desai_HSBC_Business_Development_COO_Resume.docx
+++ b/assets/Tatva_Desai_HSBC_Business_Development_COO_Resume.docx
@@ -122,7 +122,7 @@
               <w:top w:w="0" w:type="dxa"/>
               <w:start w:w="0" w:type="dxa"/>
               <w:bottom w:w="0" w:type="dxa"/>
-              <w:end w:w="100" w:type="dxa"/>
+              <w:end w:w="200" w:type="dxa"/>
             </w:tcMar>
             <w:vAlign w:val="center"/>
           </w:tcPr>
@@ -147,7 +147,7 @@
             <w:tcW w:type="dxa" w:w="1944"/>
             <w:tcMar>
               <w:top w:w="0" w:type="dxa"/>
-              <w:start w:w="100" w:type="dxa"/>
+              <w:start w:w="200" w:type="dxa"/>
               <w:bottom w:w="0" w:type="dxa"/>
               <w:end w:w="0" w:type="dxa"/>
             </w:tcMar>
@@ -205,7 +205,7 @@
               <w:top w:w="0" w:type="dxa"/>
               <w:start w:w="0" w:type="dxa"/>
               <w:bottom w:w="0" w:type="dxa"/>
-              <w:end w:w="100" w:type="dxa"/>
+              <w:end w:w="200" w:type="dxa"/>
             </w:tcMar>
             <w:vAlign w:val="center"/>
           </w:tcPr>
@@ -230,7 +230,7 @@
             <w:tcW w:type="dxa" w:w="1944"/>
             <w:tcMar>
               <w:top w:w="0" w:type="dxa"/>
-              <w:start w:w="100" w:type="dxa"/>
+              <w:start w:w="200" w:type="dxa"/>
               <w:bottom w:w="0" w:type="dxa"/>
               <w:end w:w="0" w:type="dxa"/>
             </w:tcMar>
@@ -307,7 +307,7 @@
               <w:top w:w="0" w:type="dxa"/>
               <w:start w:w="0" w:type="dxa"/>
               <w:bottom w:w="0" w:type="dxa"/>
-              <w:end w:w="100" w:type="dxa"/>
+              <w:end w:w="200" w:type="dxa"/>
             </w:tcMar>
             <w:vAlign w:val="center"/>
           </w:tcPr>
@@ -332,7 +332,7 @@
             <w:tcW w:type="dxa" w:w="1944"/>
             <w:tcMar>
               <w:top w:w="0" w:type="dxa"/>
-              <w:start w:w="100" w:type="dxa"/>
+              <w:start w:w="200" w:type="dxa"/>
               <w:bottom w:w="0" w:type="dxa"/>
               <w:end w:w="0" w:type="dxa"/>
             </w:tcMar>
@@ -441,7 +441,7 @@
               <w:top w:w="0" w:type="dxa"/>
               <w:start w:w="0" w:type="dxa"/>
               <w:bottom w:w="0" w:type="dxa"/>
-              <w:end w:w="100" w:type="dxa"/>
+              <w:end w:w="200" w:type="dxa"/>
             </w:tcMar>
             <w:vAlign w:val="center"/>
           </w:tcPr>
@@ -466,7 +466,7 @@
             <w:tcW w:type="dxa" w:w="1944"/>
             <w:tcMar>
               <w:top w:w="0" w:type="dxa"/>
-              <w:start w:w="100" w:type="dxa"/>
+              <w:start w:w="200" w:type="dxa"/>
               <w:bottom w:w="0" w:type="dxa"/>
               <w:end w:w="0" w:type="dxa"/>
             </w:tcMar>
@@ -576,7 +576,7 @@
               <w:top w:w="0" w:type="dxa"/>
               <w:start w:w="0" w:type="dxa"/>
               <w:bottom w:w="0" w:type="dxa"/>
-              <w:end w:w="100" w:type="dxa"/>
+              <w:end w:w="200" w:type="dxa"/>
             </w:tcMar>
             <w:vAlign w:val="center"/>
           </w:tcPr>
@@ -601,7 +601,7 @@
             <w:tcW w:type="dxa" w:w="1944"/>
             <w:tcMar>
               <w:top w:w="0" w:type="dxa"/>
-              <w:start w:w="100" w:type="dxa"/>
+              <w:start w:w="200" w:type="dxa"/>
               <w:bottom w:w="0" w:type="dxa"/>
               <w:end w:w="0" w:type="dxa"/>
             </w:tcMar>
@@ -729,7 +729,7 @@
               <w:top w:w="0" w:type="dxa"/>
               <w:start w:w="0" w:type="dxa"/>
               <w:bottom w:w="0" w:type="dxa"/>
-              <w:end w:w="100" w:type="dxa"/>
+              <w:end w:w="200" w:type="dxa"/>
             </w:tcMar>
             <w:vAlign w:val="center"/>
           </w:tcPr>
@@ -754,7 +754,7 @@
             <w:tcW w:type="dxa" w:w="1944"/>
             <w:tcMar>
               <w:top w:w="0" w:type="dxa"/>
-              <w:start w:w="100" w:type="dxa"/>
+              <w:start w:w="200" w:type="dxa"/>
               <w:bottom w:w="0" w:type="dxa"/>
               <w:end w:w="0" w:type="dxa"/>
             </w:tcMar>
@@ -864,7 +864,7 @@
               <w:top w:w="0" w:type="dxa"/>
               <w:start w:w="0" w:type="dxa"/>
               <w:bottom w:w="0" w:type="dxa"/>
-              <w:end w:w="100" w:type="dxa"/>
+              <w:end w:w="200" w:type="dxa"/>
             </w:tcMar>
             <w:vAlign w:val="center"/>
           </w:tcPr>
@@ -889,7 +889,7 @@
             <w:tcW w:type="dxa" w:w="1944"/>
             <w:tcMar>
               <w:top w:w="0" w:type="dxa"/>
-              <w:start w:w="100" w:type="dxa"/>
+              <w:start w:w="200" w:type="dxa"/>
               <w:bottom w:w="0" w:type="dxa"/>
               <w:end w:w="0" w:type="dxa"/>
             </w:tcMar>
@@ -999,7 +999,7 @@
               <w:top w:w="0" w:type="dxa"/>
               <w:start w:w="0" w:type="dxa"/>
               <w:bottom w:w="0" w:type="dxa"/>
-              <w:end w:w="100" w:type="dxa"/>
+              <w:end w:w="200" w:type="dxa"/>
             </w:tcMar>
             <w:vAlign w:val="center"/>
           </w:tcPr>
@@ -1024,7 +1024,7 @@
             <w:tcW w:type="dxa" w:w="1944"/>
             <w:tcMar>
               <w:top w:w="0" w:type="dxa"/>
-              <w:start w:w="100" w:type="dxa"/>
+              <w:start w:w="200" w:type="dxa"/>
               <w:bottom w:w="0" w:type="dxa"/>
               <w:end w:w="0" w:type="dxa"/>
             </w:tcMar>
@@ -1108,7 +1108,7 @@
               <w:top w:w="0" w:type="dxa"/>
               <w:start w:w="0" w:type="dxa"/>
               <w:bottom w:w="0" w:type="dxa"/>
-              <w:end w:w="100" w:type="dxa"/>
+              <w:end w:w="200" w:type="dxa"/>
             </w:tcMar>
             <w:vAlign w:val="center"/>
           </w:tcPr>
@@ -1133,7 +1133,7 @@
             <w:tcW w:type="dxa" w:w="1944"/>
             <w:tcMar>
               <w:top w:w="0" w:type="dxa"/>
-              <w:start w:w="100" w:type="dxa"/>
+              <w:start w:w="200" w:type="dxa"/>
               <w:bottom w:w="0" w:type="dxa"/>
               <w:end w:w="0" w:type="dxa"/>
             </w:tcMar>

</xml_diff>